<commit_message>
Add questionnaire and final pdf version.
</commit_message>
<xml_diff>
--- a/report/porocilo.docx
+++ b/report/porocilo.docx
@@ -11236,7 +11236,7 @@
       </w:r>
     </w:p>
     <w:bookmarkEnd w:id="90"/>
-    <w:bookmarkStart w:id="99" w:name="priloge"/>
+    <w:bookmarkStart w:id="100" w:name="priloge"/>
     <w:p>
       <w:pPr>
         <w:pStyle w:val="Heading1"/>
@@ -13479,26 +13479,26 @@
         <w:pStyle w:val="FirstParagraph"/>
       </w:pPr>
       <w:r>
-        <w:t xml:space="preserve">Skenirana kopija praznega vprašalnika (slovenska različica), kakršen je</w:t>
-      </w:r>
-      <w:r>
-        <w:t xml:space="preserve"> </w:t>
-      </w:r>
-      <w:r>
-        <w:t xml:space="preserve">bil uporabljen na sejah, je priložena ločeno (</w:t>
+        <w:t xml:space="preserve">Kopija praznega vprašalnika (slovenska različica), kakršen je</w:t>
+      </w:r>
+      <w:r>
+        <w:t xml:space="preserve"> </w:t>
+      </w:r>
+      <w:r>
+        <w:t xml:space="preserve">bil uporabljen na sejah, je priložena ločeno in dostopna v repozitoriju (</w:t>
       </w:r>
       <w:r>
         <w:rPr>
           <w:rStyle w:val="VerbatimChar"/>
         </w:rPr>
-        <w:t xml:space="preserve">data/raw/questionnaire.pdf</w:t>
+        <w:t xml:space="preserve">data/raw/Vprašalnik_Zvočni objem.pdf</w:t>
       </w:r>
       <w:r>
         <w:t xml:space="preserve">).</w:t>
       </w:r>
     </w:p>
     <w:bookmarkEnd w:id="97"/>
-    <w:bookmarkStart w:id="98" w:name="e.-reproducibilnost"/>
+    <w:bookmarkStart w:id="99" w:name="e.-reproducibilnost"/>
     <w:p>
       <w:pPr>
         <w:pStyle w:val="Heading2"/>
@@ -13521,7 +13521,21 @@
         <w:pStyle w:val="FirstParagraph"/>
       </w:pPr>
       <w:r>
-        <w:t xml:space="preserve">Celotna koda je dostopna v projektnem repozitoriju. Glavni skripti:</w:t>
+        <w:t xml:space="preserve">Celotna koda je dostopna v projektnem repozitoriju</w:t>
+      </w:r>
+      <w:r>
+        <w:t xml:space="preserve"> </w:t>
+      </w:r>
+      <w:hyperlink r:id="rId98">
+        <w:r>
+          <w:rPr>
+            <w:rStyle w:val="Hyperlink"/>
+          </w:rPr>
+          <w:t xml:space="preserve">https://github.com/majazaloznik/tinitus</w:t>
+        </w:r>
+      </w:hyperlink>
+      <w:r>
+        <w:t xml:space="preserve">. Glavne skripte:</w:t>
       </w:r>
     </w:p>
     <w:p>
@@ -13711,8 +13725,8 @@
         <w:t xml:space="preserve">odgovornost za vsebino.</w:t>
       </w:r>
     </w:p>
-    <w:bookmarkEnd w:id="98"/>
     <w:bookmarkEnd w:id="99"/>
+    <w:bookmarkEnd w:id="100"/>
     <w:sectPr>
       <w:footnotePr>
         <w:numRestart w:val="eachSect"/>

</xml_diff>